<commit_message>
Poster: draft v03, added Prof in Report
</commit_message>
<xml_diff>
--- a/Projektbericht/Bericht_FuE_RoboterTetris_V06.docx
+++ b/Projektbericht/Bericht_FuE_RoboterTetris_V06.docx
@@ -480,6 +480,93 @@
     <w:p>
       <w:pPr>
         <w:spacing w:after="0" w:line="240" w:lineRule="auto"/>
+        <w:jc w:val="center"/>
+        <w:textAlignment w:val="baseline"/>
+        <w:rPr>
+          <w:rFonts w:eastAsia="Times New Roman" w:cstheme="minorHAnsi"/>
+          <w:b/>
+          <w:bCs/>
+          <w:kern w:val="0"/>
+          <w:szCs w:val="24"/>
+          <w:lang w:val="de-DE" w:eastAsia="de-DE"/>
+          <w14:ligatures w14:val="none"/>
+        </w:rPr>
+      </w:pPr>
+    </w:p>
+    <w:p>
+      <w:pPr>
+        <w:spacing w:after="0" w:line="240" w:lineRule="auto"/>
+        <w:jc w:val="center"/>
+        <w:textAlignment w:val="baseline"/>
+        <w:rPr>
+          <w:rFonts w:eastAsia="Times New Roman" w:cstheme="minorHAnsi"/>
+          <w:b/>
+          <w:bCs/>
+          <w:kern w:val="0"/>
+          <w:szCs w:val="24"/>
+          <w:lang w:val="de-DE" w:eastAsia="de-DE"/>
+          <w14:ligatures w14:val="none"/>
+        </w:rPr>
+      </w:pPr>
+      <w:r>
+        <w:rPr>
+          <w:rFonts w:eastAsia="Times New Roman" w:cstheme="minorHAnsi"/>
+          <w:b/>
+          <w:bCs/>
+          <w:kern w:val="0"/>
+          <w:szCs w:val="24"/>
+          <w:lang w:val="de-DE" w:eastAsia="de-DE"/>
+          <w14:ligatures w14:val="none"/>
+        </w:rPr>
+        <w:t xml:space="preserve">Betreuer: </w:t>
+      </w:r>
+      <w:r>
+        <w:rPr>
+          <w:rFonts w:eastAsia="Times New Roman" w:cstheme="minorHAnsi"/>
+          <w:kern w:val="0"/>
+          <w:szCs w:val="24"/>
+          <w:lang w:val="de-DE" w:eastAsia="de-DE"/>
+          <w14:ligatures w14:val="none"/>
+        </w:rPr>
+        <w:t>Prof. Björn Hein</w:t>
+      </w:r>
+      <w:r>
+        <w:rPr>
+          <w:rFonts w:eastAsia="Times New Roman" w:cstheme="minorHAnsi"/>
+          <w:kern w:val="0"/>
+          <w:szCs w:val="24"/>
+          <w:lang w:val="de-DE" w:eastAsia="de-DE"/>
+          <w14:ligatures w14:val="none"/>
+        </w:rPr>
+        <w:t xml:space="preserve">; </w:t>
+      </w:r>
+      <w:hyperlink r:id="rId9" w:history="1">
+        <w:r>
+          <w:rPr>
+            <w:rStyle w:val="Hyperlink"/>
+            <w:rFonts w:eastAsia="Times New Roman" w:cstheme="minorHAnsi"/>
+            <w:kern w:val="0"/>
+            <w:szCs w:val="24"/>
+            <w:lang w:val="de-DE" w:eastAsia="de-DE"/>
+            <w14:ligatures w14:val="none"/>
+          </w:rPr>
+          <w:t>bjoern.hein@h-ka.de</w:t>
+        </w:r>
+      </w:hyperlink>
+      <w:r>
+        <w:rPr>
+          <w:rFonts w:eastAsia="Times New Roman" w:cstheme="minorHAnsi"/>
+          <w:kern w:val="0"/>
+          <w:szCs w:val="24"/>
+          <w:lang w:val="de-DE" w:eastAsia="de-DE"/>
+          <w14:ligatures w14:val="none"/>
+        </w:rPr>
+        <w:t xml:space="preserve"> </w:t>
+      </w:r>
+    </w:p>
+    <w:p>
+      <w:pPr>
+        <w:spacing w:after="0" w:line="240" w:lineRule="auto"/>
         <w:jc w:val="left"/>
         <w:textAlignment w:val="baseline"/>
         <w:rPr>
@@ -641,7 +728,7 @@
         </w:rPr>
         <w:t>.-Nr. 67328; </w:t>
       </w:r>
-      <w:hyperlink r:id="rId9" w:tgtFrame="_blank" w:history="1">
+      <w:hyperlink r:id="rId10" w:tgtFrame="_blank" w:history="1">
         <w:r>
           <w:rPr>
             <w:rStyle w:val="Hyperlink"/>
@@ -737,7 +824,7 @@
         </w:rPr>
         <w:t xml:space="preserve"> </w:t>
       </w:r>
-      <w:hyperlink r:id="rId10" w:history="1">
+      <w:hyperlink r:id="rId11" w:history="1">
         <w:r>
           <w:rPr>
             <w:rStyle w:val="Hyperlink"/>
@@ -816,7 +903,7 @@
         </w:rPr>
         <w:t>; </w:t>
       </w:r>
-      <w:hyperlink r:id="rId11" w:history="1">
+      <w:hyperlink r:id="rId12" w:history="1">
         <w:r>
           <w:rPr>
             <w:rStyle w:val="Hyperlink"/>
@@ -1211,6 +1298,7 @@
           <w:docPartUnique/>
         </w:docPartObj>
       </w:sdtPr>
+      <w:sdtEndPr/>
       <w:sdtContent>
         <w:p>
           <w:pPr>
@@ -7165,7 +7253,13 @@
         <w:rPr>
           <w:lang w:val="de-DE"/>
         </w:rPr>
-        <w:t>Neben dem Greifvorgang soll das System die Klötze nach Form und Farbe kategorisieren. Die Kategorisierung dient der flexiblen Objektbeschreibung, nicht einer Ablageaufgabe. Sie soll die Übertragbarkeit des Konzepts auf weitere vergleichbare Anwendungsfälle ermöglichen. Befinden sich mehrere Klötze gleichzeitig auf dem Förderband, soll das System selbstständig einen noch erreichbaren Klotz auswählen. Klötze, die innerhalb des verbleibenden Arbeitsbereichs nicht sicher erreichbar sind, werden nicht mehr als Ziel verfolgt.</w:t>
+        <w:t>Neben dem Greifvorgang soll das System die Klötze nach Form und Farbe kategorisieren. Die Kategorisierung dient der flexiblen Objektbeschreibung, nicht einer Ablageaufgabe. Sie soll die Übertragbarkeit des Konzepts auf weitere vergleichbare Anwendungsfälle ermöglichen. Befinden sich mehrere Klötze gleichzeitig auf dem Förderband, soll das System selbstständig einen noch erreichbaren Klotz auswählen. Klötze, die innerhalb des verbleibenden Arbeitsbereichs nicht sicher erreichbar sind, werden nicht mehr als Z</w:t>
+      </w:r>
+      <w:r>
+        <w:rPr>
+          <w:lang w:val="de-DE"/>
+        </w:rPr>
+        <w:t>iel verfolgt.</w:t>
       </w:r>
     </w:p>
     <w:p>
@@ -7372,10 +7466,14 @@
           <w:rFonts w:asciiTheme="majorHAnsi" w:eastAsiaTheme="majorEastAsia" w:hAnsiTheme="majorHAnsi" w:cstheme="majorBidi"/>
           <w:sz w:val="40"/>
           <w:szCs w:val="40"/>
+          <w:lang w:val="de-DE"/>
         </w:rPr>
       </w:pPr>
       <w:bookmarkStart w:id="14" w:name="ch_2"/>
       <w:r>
+        <w:rPr>
+          <w:lang w:val="de-DE"/>
+        </w:rPr>
         <w:br w:type="page"/>
       </w:r>
     </w:p>
@@ -7598,7 +7696,13 @@
         <w:rPr>
           <w:lang w:val="de-DE"/>
         </w:rPr>
-        <w:t>Die nutzbare gerade Förderstrecke beträgt ungefähr 1,50 m bei einer Breite von etwa 0,80 m. Das Förderband ist physisch etwas länger. Die gekrümmten Bereiche über den Bandrollen stehen jedoch nicht als Greifbereich zur Verfügung. Die Bandkanten liegen im globalen System ungefähr bei x = -1,275 m und x = -0,480 m. Der für das Greifen nutzbare rechteckige Bereich reicht von x = -1,000 m bis -0,530 m sowie von y = -0,320 m bis 0,445 m. Er wird in der Draufsicht als Arbeitsbereich dargestellt. Der festgelegte Arbeitsraum des Flansches erweitert diesen Bereich für die Ablage der Objekte auf x = -1,000 m bis -0,300 m und y = -0,320 m bis 0,480 m.</w:t>
+        <w:t>Die nutzbare gerade Förderstrecke beträgt ungefähr 1,50 m bei einer Breite von etwa 0,80 m. Das Förderband ist physisch etwas länger. Die gekrümmten Bereiche über den Bandrollen stehen jedoch nicht als Greifbereich zur Verfügung. Die Bandkanten liegen im globalen System ungefähr bei x = -1,275 m und x = -0,480 m. Der für das Greifen nutzbare rechteckige Bereich reicht von x = -1,000 m bis -0,530 m sowie von y = -0,320 m bis 0,445 m. Er wird in der Draufsicht als Arbeitsbereich dargestellt. Der festgelegte A</w:t>
+      </w:r>
+      <w:r>
+        <w:rPr>
+          <w:lang w:val="de-DE"/>
+        </w:rPr>
+        <w:t>rbeitsraum des Flansches erweitert diesen Bereich für die Ablage der Objekte auf x = -1,000 m bis -0,300 m und y = -0,320 m bis 0,480 m.</w:t>
       </w:r>
     </w:p>
     <w:p>
@@ -7628,66 +7732,6 @@
             <wp:extent cx="4199466" cy="3149600"/>
             <wp:effectExtent l="0" t="0" r="0" b="0"/>
             <wp:docPr id="755115071" name="Picture 755115071"/>
-            <wp:cNvGraphicFramePr>
-              <a:graphicFrameLocks xmlns:a="http://schemas.openxmlformats.org/drawingml/2006/main" noChangeAspect="1"/>
-            </wp:cNvGraphicFramePr>
-            <a:graphic xmlns:a="http://schemas.openxmlformats.org/drawingml/2006/main">
-              <a:graphicData uri="http://schemas.openxmlformats.org/drawingml/2006/picture">
-                <pic:pic xmlns:pic="http://schemas.openxmlformats.org/drawingml/2006/picture">
-                  <pic:nvPicPr>
-                    <pic:cNvPr id="0" name="image.jpg"/>
-                    <pic:cNvPicPr/>
-                  </pic:nvPicPr>
-                  <pic:blipFill>
-                    <a:blip r:embed="rId12"/>
-                    <a:stretch>
-                      <a:fillRect/>
-                    </a:stretch>
-                  </pic:blipFill>
-                  <pic:spPr>
-                    <a:xfrm>
-                      <a:off x="0" y="0"/>
-                      <a:ext cx="4204909" cy="3153682"/>
-                    </a:xfrm>
-                    <a:prstGeom prst="rect">
-                      <a:avLst/>
-                    </a:prstGeom>
-                  </pic:spPr>
-                </pic:pic>
-              </a:graphicData>
-            </a:graphic>
-          </wp:inline>
-        </w:drawing>
-      </w:r>
-    </w:p>
-    <w:p>
-      <w:pPr>
-        <w:pStyle w:val="Beschriftung"/>
-        <w:jc w:val="center"/>
-        <w:rPr>
-          <w:lang w:val="de-DE"/>
-        </w:rPr>
-      </w:pPr>
-      <w:r>
-        <w:rPr>
-          <w:lang w:val="de-DE"/>
-        </w:rPr>
-        <w:t>Abbildung 1: Versuchsaufbau mit Förderband, UR10e und Ablagekiste.</w:t>
-      </w:r>
-    </w:p>
-    <w:p>
-      <w:pPr>
-        <w:jc w:val="center"/>
-      </w:pPr>
-      <w:r>
-        <w:rPr>
-          <w:noProof/>
-        </w:rPr>
-        <w:drawing>
-          <wp:inline distT="0" distB="0" distL="0" distR="0" wp14:anchorId="08B3CCBA" wp14:editId="5C5E885C">
-            <wp:extent cx="4121150" cy="3090863"/>
-            <wp:effectExtent l="0" t="0" r="0" b="0"/>
-            <wp:docPr id="755115072" name="Picture 755115072"/>
             <wp:cNvGraphicFramePr>
               <a:graphicFrameLocks xmlns:a="http://schemas.openxmlformats.org/drawingml/2006/main" noChangeAspect="1"/>
             </wp:cNvGraphicFramePr>
@@ -7707,6 +7751,66 @@
                   <pic:spPr>
                     <a:xfrm>
                       <a:off x="0" y="0"/>
+                      <a:ext cx="4204909" cy="3153682"/>
+                    </a:xfrm>
+                    <a:prstGeom prst="rect">
+                      <a:avLst/>
+                    </a:prstGeom>
+                  </pic:spPr>
+                </pic:pic>
+              </a:graphicData>
+            </a:graphic>
+          </wp:inline>
+        </w:drawing>
+      </w:r>
+    </w:p>
+    <w:p>
+      <w:pPr>
+        <w:pStyle w:val="Beschriftung"/>
+        <w:jc w:val="center"/>
+        <w:rPr>
+          <w:lang w:val="de-DE"/>
+        </w:rPr>
+      </w:pPr>
+      <w:r>
+        <w:rPr>
+          <w:lang w:val="de-DE"/>
+        </w:rPr>
+        <w:t>Abbildung 1: Versuchsaufbau mit Förderband, UR10e und Ablagekiste.</w:t>
+      </w:r>
+    </w:p>
+    <w:p>
+      <w:pPr>
+        <w:jc w:val="center"/>
+      </w:pPr>
+      <w:r>
+        <w:rPr>
+          <w:noProof/>
+        </w:rPr>
+        <w:drawing>
+          <wp:inline distT="0" distB="0" distL="0" distR="0" wp14:anchorId="08B3CCBA" wp14:editId="5C5E885C">
+            <wp:extent cx="4121150" cy="3090863"/>
+            <wp:effectExtent l="0" t="0" r="0" b="0"/>
+            <wp:docPr id="755115072" name="Picture 755115072"/>
+            <wp:cNvGraphicFramePr>
+              <a:graphicFrameLocks xmlns:a="http://schemas.openxmlformats.org/drawingml/2006/main" noChangeAspect="1"/>
+            </wp:cNvGraphicFramePr>
+            <a:graphic xmlns:a="http://schemas.openxmlformats.org/drawingml/2006/main">
+              <a:graphicData uri="http://schemas.openxmlformats.org/drawingml/2006/picture">
+                <pic:pic xmlns:pic="http://schemas.openxmlformats.org/drawingml/2006/picture">
+                  <pic:nvPicPr>
+                    <pic:cNvPr id="0" name="image.jpg"/>
+                    <pic:cNvPicPr/>
+                  </pic:nvPicPr>
+                  <pic:blipFill>
+                    <a:blip r:embed="rId14"/>
+                    <a:stretch>
+                      <a:fillRect/>
+                    </a:stretch>
+                  </pic:blipFill>
+                  <pic:spPr>
+                    <a:xfrm>
+                      <a:off x="0" y="0"/>
                       <a:ext cx="4126152" cy="3094614"/>
                     </a:xfrm>
                     <a:prstGeom prst="rect">
@@ -7740,6 +7844,9 @@
         <w:jc w:val="center"/>
       </w:pPr>
       <w:r>
+        <w:rPr>
+          <w:noProof/>
+        </w:rPr>
         <w:lastRenderedPageBreak/>
         <w:drawing>
           <wp:inline distT="0" distB="0" distL="0" distR="0" wp14:anchorId="4F8A2E1A" wp14:editId="503E0681">
@@ -7757,7 +7864,7 @@
                     <pic:cNvPicPr/>
                   </pic:nvPicPr>
                   <pic:blipFill>
-                    <a:blip r:embed="rId14"/>
+                    <a:blip r:embed="rId15"/>
                     <a:stretch>
                       <a:fillRect/>
                     </a:stretch>
@@ -7866,6 +7973,9 @@
         <w:jc w:val="center"/>
       </w:pPr>
       <w:r>
+        <w:rPr>
+          <w:noProof/>
+        </w:rPr>
         <w:lastRenderedPageBreak/>
         <w:drawing>
           <wp:inline distT="0" distB="0" distL="0" distR="0" wp14:anchorId="5143271B" wp14:editId="337E74F1">
@@ -7883,7 +7993,7 @@
                     <pic:cNvPicPr/>
                   </pic:nvPicPr>
                   <pic:blipFill>
-                    <a:blip r:embed="rId15"/>
+                    <a:blip r:embed="rId16"/>
                     <a:stretch>
                       <a:fillRect/>
                     </a:stretch>
@@ -7975,7 +8085,13 @@
         <w:rPr>
           <w:lang w:val="de-DE"/>
         </w:rPr>
-        <w:t>Der UR10e ist für kollaborative Anwendungen ausgelegt. Seine Sicherheitsfunktionen können unter anderem Grenzen für Geschwindigkeit, Kraft, Impuls und Leistung überwachen. Wird eine konfigurierte Grenze überschritten oder ein Sicherheitsfehler erkannt, wird die Roboterbewegung sicher unterbrochen [7]. Ob der Aufbau ohne trennende Schutzeinrichtung betrieben werden darf, ergibt sich jedoch erst aus der Risikobeurteilung des gesamten Systems. Dabei müssen insbesondere Greifer, Klötze, Bewegungen und Quetschstellen berücksichtigt werden. Der Endeffektor ist nicht automatisch durch die Sicherheitsfunktionen des Roboterarms abgedeckt [8].</w:t>
+        <w:t>Der UR10e ist für kollaborative Anwendungen ausgelegt. Seine Sicherheitsfunktionen können unter anderem Grenzen für Geschwindigkeit, Kraft, Impuls und Leistung überwachen. Wird eine konfigurierte Grenze überschritten oder ein Sicherheitsfehler erkannt, wird die Roboterbewegung sicher unterbrochen [7]. Ob der Aufbau ohne trennende Schutzeinrichtung betrieben werden darf, ergibt sich jedoch erst aus der Risikobeurteilung des gesamten Systems. Dabei müssen insbesondere Greifer, Klötze, Bewegungen und Quetschst</w:t>
+      </w:r>
+      <w:r>
+        <w:rPr>
+          <w:lang w:val="de-DE"/>
+        </w:rPr>
+        <w:t>ellen berücksichtigt werden. Der Endeffektor ist nicht automatisch durch die Sicherheitsfunktionen des Roboterarms abgedeckt [8].</w:t>
       </w:r>
       <w:r>
         <w:rPr>
@@ -8041,7 +8157,15 @@
       </w:r>
       <w:proofErr w:type="spellEnd"/>
       <w:r>
-        <w:t xml:space="preserve"> Greifers zeigt Abbildung 5 [9].</w:t>
+        <w:t xml:space="preserve"> </w:t>
+      </w:r>
+      <w:proofErr w:type="spellStart"/>
+      <w:r>
+        <w:t>Greifers</w:t>
+      </w:r>
+      <w:proofErr w:type="spellEnd"/>
+      <w:r>
+        <w:t xml:space="preserve"> zeigt Abbildung 5 [9].</w:t>
       </w:r>
     </w:p>
     <w:p>
@@ -8058,620 +8182,6 @@
             <wp:extent cx="5580000" cy="5083117"/>
             <wp:effectExtent l="0" t="0" r="0" b="0"/>
             <wp:docPr id="755115075" name="Picture 755115075"/>
-            <wp:cNvGraphicFramePr>
-              <a:graphicFrameLocks xmlns:a="http://schemas.openxmlformats.org/drawingml/2006/main" noChangeAspect="1"/>
-            </wp:cNvGraphicFramePr>
-            <a:graphic xmlns:a="http://schemas.openxmlformats.org/drawingml/2006/main">
-              <a:graphicData uri="http://schemas.openxmlformats.org/drawingml/2006/picture">
-                <pic:pic xmlns:pic="http://schemas.openxmlformats.org/drawingml/2006/picture">
-                  <pic:nvPicPr>
-                    <pic:cNvPr id="0" name="image.png"/>
-                    <pic:cNvPicPr/>
-                  </pic:nvPicPr>
-                  <pic:blipFill>
-                    <a:blip r:embed="rId16"/>
-                    <a:stretch>
-                      <a:fillRect/>
-                    </a:stretch>
-                  </pic:blipFill>
-                  <pic:spPr>
-                    <a:xfrm>
-                      <a:off x="0" y="0"/>
-                      <a:ext cx="5580000" cy="5083117"/>
-                    </a:xfrm>
-                    <a:prstGeom prst="rect">
-                      <a:avLst/>
-                    </a:prstGeom>
-                  </pic:spPr>
-                </pic:pic>
-              </a:graphicData>
-            </a:graphic>
-          </wp:inline>
-        </w:drawing>
-      </w:r>
-    </w:p>
-    <w:p>
-      <w:pPr>
-        <w:pStyle w:val="Beschriftung"/>
-        <w:jc w:val="center"/>
-        <w:rPr>
-          <w:lang w:val="de-DE"/>
-        </w:rPr>
-      </w:pPr>
-      <w:r>
-        <w:rPr>
-          <w:lang w:val="de-DE"/>
-        </w:rPr>
-        <w:t>Abbildung 5: Herstellerabmessungen des geöffneten Robotiq-2F-140-Greifers (Quelle: [9]).</w:t>
-      </w:r>
-    </w:p>
-    <w:p>
-      <w:pPr>
-        <w:rPr>
-          <w:lang w:val="de-DE"/>
-        </w:rPr>
-      </w:pPr>
-      <w:r>
-        <w:rPr>
-          <w:lang w:val="de-DE"/>
-        </w:rPr>
-        <w:t>Jeder Finger besteht aus zwei starren Abschnitten. Diese Abschnitte werden Phalangen genannt und sind über ein Gelenk verbunden. Ein einziger Antrieb bewegt beide Finger. Der Greifer besitzt damit weniger Antriebe als Gelenke. Beim Schließen drehen sich die Phalangen um ihre Gelenke. Die Greifflächen folgen deshalb einer gekrümmten Bahn und nicht einer geraden parallelen Bewegung. Abhängig von Geometrie und Lage des Klotzes entsteht ein paralleler oder umschließender Griff [10].</w:t>
-      </w:r>
-    </w:p>
-    <w:p>
-      <w:pPr>
-        <w:rPr>
-          <w:lang w:val="de-DE"/>
-        </w:rPr>
-      </w:pPr>
-      <w:r>
-        <w:rPr>
-          <w:lang w:val="de-DE"/>
-        </w:rPr>
-        <w:t>Ein Klotz kann deshalb an seinen Seiten nicht beliebig tief gegriffen werden. Bei einem zu tiefen seitlichen Eingriff würden die Phalangen beim Schließen mit der Oberseite des Klotzes kollidieren. Die Greiftiefe ist somit durch die Fingergeometrie begrenzt. Außerdem verändert sich die räumliche Höhe des Greifers zwischen offenem und geschlossenem Zustand. Der zulässige Arbeitsraum und die Greifhöhe müssen diese Zustandsänderung berücksichtigen.</w:t>
-      </w:r>
-    </w:p>
-    <w:p>
-      <w:pPr>
-        <w:rPr>
-          <w:lang w:val="de-DE"/>
-        </w:rPr>
-      </w:pPr>
-      <w:r>
-        <w:rPr>
-          <w:lang w:val="de-DE"/>
-        </w:rPr>
-        <w:t xml:space="preserve">Schließgeschwindigkeit und Schließkraft sind einstellbar. Der Kraftwert begrenzt den maximalen Motorstrom und damit die beim Schließen verfügbare Greifkraft. Treffen die Finger auf einen Widerstand und wird diese Grenze erreicht, hält der Greifer an. Sein Gerätestatus meldet den Kontakt als erkannte Objektaufnahme. Bei geeigneter Kraftkonfiguration kann die </w:t>
-      </w:r>
-      <w:r>
-        <w:rPr>
-          <w:lang w:val="de-DE"/>
-        </w:rPr>
-        <w:lastRenderedPageBreak/>
-        <w:t>integrierte Nachgreiffunktion einen späteren Objektverlust erkennen und die Finger weiter schließen [10].</w:t>
-      </w:r>
-    </w:p>
-    <w:p>
-      <w:pPr>
-        <w:rPr>
-          <w:lang w:val="de-DE"/>
-        </w:rPr>
-      </w:pPr>
-      <w:r>
-        <w:rPr>
-          <w:lang w:val="de-DE"/>
-        </w:rPr>
-        <w:t>Die tatsächlich nutzbare Öffnungsweite wurde am aufgebauten System mit 127 mm gemessen. An den Fingerendgliedern sind 3D-gedruckte Aufsätze mit Gummi-</w:t>
-      </w:r>
-      <w:proofErr w:type="spellStart"/>
-      <w:r>
-        <w:rPr>
-          <w:lang w:val="de-DE"/>
-        </w:rPr>
-        <w:t>Grippmatten</w:t>
-      </w:r>
-      <w:proofErr w:type="spellEnd"/>
-      <w:r>
-        <w:rPr>
-          <w:lang w:val="de-DE"/>
-        </w:rPr>
-        <w:t xml:space="preserve"> montiert. Die Greiffläche jeder Matte beträgt 20 mm × 15 mm.</w:t>
-      </w:r>
-    </w:p>
-    <w:p>
-      <w:pPr>
-        <w:rPr>
-          <w:lang w:val="de-DE"/>
-        </w:rPr>
-      </w:pPr>
-      <w:r>
-        <w:rPr>
-          <w:lang w:val="de-DE"/>
-        </w:rPr>
-        <w:t>Vor dem Betrieb wird der Öffnungsbereich des Greifers kalibriert. Dadurch ist die Öffnungsweite im aufgebauten System als Millimeterwert verfügbar. Der Greifer ist über USB mit dem Rechner verbunden. Er wird damit extern angesteuert und nicht über die direkte Roboteransteuerung bedient.</w:t>
-      </w:r>
-      <w:r>
-        <w:rPr>
-          <w:lang w:val="de-DE"/>
-        </w:rPr>
-        <w:t xml:space="preserve"> </w:t>
-      </w:r>
-    </w:p>
-    <w:p>
-      <w:pPr>
-        <w:rPr>
-          <w:lang w:val="de-DE"/>
-        </w:rPr>
-      </w:pPr>
-    </w:p>
-    <w:p>
-      <w:pPr>
-        <w:pStyle w:val="berschrift3"/>
-      </w:pPr>
-      <w:bookmarkStart w:id="24" w:name="ch_2_1_4"/>
-      <w:bookmarkStart w:id="25" w:name="_Toc241704879"/>
-      <w:proofErr w:type="spellStart"/>
-      <w:r>
-        <w:t>Förderband</w:t>
-      </w:r>
-      <w:proofErr w:type="spellEnd"/>
-      <w:r>
-        <w:t xml:space="preserve"> und </w:t>
-      </w:r>
-      <w:proofErr w:type="spellStart"/>
-      <w:r>
-        <w:t>Klötze</w:t>
-      </w:r>
-      <w:bookmarkEnd w:id="24"/>
-      <w:bookmarkEnd w:id="25"/>
-      <w:proofErr w:type="spellEnd"/>
-    </w:p>
-    <w:p>
-      <w:pPr>
-        <w:rPr>
-          <w:lang w:val="de-DE"/>
-        </w:rPr>
-      </w:pPr>
-      <w:r>
-        <w:rPr>
-          <w:lang w:val="de-DE"/>
-        </w:rPr>
-        <w:t>Das Förderband führt die Klötze vom manuellen Auflagepunkt am Bandanfang durch den Erfassungsbereich der Basiskamera zur Greifzone. Die Geschwindigkeit bleibt während eines Versuchs konstant. Vor Versuchsbeginn können verschiedene Geschwindigkeitsstufen eingestellt werden. Eine Stoppuhrmessung der niedrigsten Einstellung, Stufe 1, ergab Werte zwischen 125 mm/s und 133 mm/s [11]. Die gemessene Geschwindigkeit dient später als Gegenprobe für die aus den Bilddaten geschätzte Bandgeschwindigkeit.</w:t>
-      </w:r>
-    </w:p>
-    <w:p>
-      <w:pPr>
-        <w:rPr>
-          <w:lang w:val="de-DE"/>
-        </w:rPr>
-      </w:pPr>
-      <w:r>
-        <w:rPr>
-          <w:lang w:val="de-DE"/>
-        </w:rPr>
-        <w:t>Für die Versuche wurden ausschließlich quaderförmige, 3D-gedruckte Klötze verwendet. Der am häufigsten verwendete flache Klotz besitzt die Abmessungen 25 mm × 50 mm × 75 mm. Daneben kamen ein großer Quader mit 100 mm × 50 mm × 50 mm sowie Würfel mit einer Kantenlänge von 50 mm zum Einsatz. Die Klötze sind rot, blau, weiß oder schwarz. Ihre Oberseiten sind überwiegend matt, während einzelne Seitenflächen stärker reflektieren [11].</w:t>
-      </w:r>
-    </w:p>
-    <w:p>
-      <w:pPr>
-        <w:rPr>
-          <w:lang w:val="de-DE"/>
-        </w:rPr>
-      </w:pPr>
-      <w:r>
-        <w:rPr>
-          <w:lang w:val="de-DE"/>
-        </w:rPr>
-        <w:t>Die Klötze können stehend, liegend, flach oder gedreht auf dem Band liegen. Runde Klötze wurden bewusst ausgeschlossen. Ihre Orientierung lässt sich mit dem gewählten Ansatz nicht eindeutig erfassen und ist für den vorgesehenen Greifablauf nicht erforderlich. Die verwendeten Geometrien begrenzen den Funktionsnachweis damit auf quaderförmige Objekte.</w:t>
-      </w:r>
-      <w:r>
-        <w:rPr>
-          <w:lang w:val="de-DE"/>
-        </w:rPr>
-        <w:t xml:space="preserve"> </w:t>
-      </w:r>
-    </w:p>
-    <w:p>
-      <w:pPr>
-        <w:rPr>
-          <w:lang w:val="de-DE"/>
-        </w:rPr>
-      </w:pPr>
-    </w:p>
-    <w:p>
-      <w:pPr>
-        <w:pStyle w:val="berschrift3"/>
-      </w:pPr>
-      <w:bookmarkStart w:id="26" w:name="ch_2_1_5"/>
-      <w:bookmarkStart w:id="27" w:name="_Toc241704880"/>
-      <w:r>
-        <w:t>Basiskamera</w:t>
-      </w:r>
-      <w:bookmarkEnd w:id="26"/>
-      <w:bookmarkEnd w:id="27"/>
-    </w:p>
-    <w:p>
-      <w:pPr>
-        <w:rPr>
-          <w:lang w:val="de-DE"/>
-        </w:rPr>
-      </w:pPr>
-      <w:r>
-        <w:rPr>
-          <w:lang w:val="de-DE"/>
-        </w:rPr>
-        <w:t>Die Basiskamera ist die zentrale Sensorik des finalen Greifablaufs. Die L515 liefert ein RGB-Bild mit 1.280 × 720 Pixel bei 15 Hz und ein Tiefenbild mit 640 × 480 Pixel bei 30 Hz. Die unterschiedliche Rate ergibt sich aus dem verwendeten Tiefenprofil der L515 [12].</w:t>
-      </w:r>
-    </w:p>
-    <w:p>
-      <w:pPr>
-        <w:rPr>
-          <w:lang w:val="de-DE"/>
-        </w:rPr>
-      </w:pPr>
-      <w:r>
-        <w:rPr>
-          <w:lang w:val="de-DE"/>
-        </w:rPr>
-        <w:t xml:space="preserve">Der sichtbare Bandbereich reicht im Bezugssystem </w:t>
-      </w:r>
-      <w:proofErr w:type="spellStart"/>
-      <w:r>
-        <w:rPr>
-          <w:lang w:val="de-DE"/>
-        </w:rPr>
-        <w:t>world</w:t>
-      </w:r>
-      <w:proofErr w:type="spellEnd"/>
-      <w:r>
-        <w:rPr>
-          <w:lang w:val="de-DE"/>
-        </w:rPr>
-        <w:t xml:space="preserve"> ungefähr von y = +1,03 m bis y = +0,46 m. Die Greifzone beginnt unmittelbar hinter diesem Bildbereich. Der Roboter und sein Greifer verdecken die Kamera damit während des Greifvorgangs nicht. Die weitere Führung eines erkannten Klotzes bis zur Greifzone wird erst im Kapitel zum Greifkonzept beschrieben.</w:t>
-      </w:r>
-    </w:p>
-    <w:p>
-      <w:r>
-        <w:rPr>
-          <w:lang w:val="de-DE"/>
-        </w:rPr>
-        <w:t xml:space="preserve">Das Gestell der Kamera ist nicht ausreichend steif, um ihre Lage nach Änderungen am Aufbau dauerhaft als unveränderlich anzunehmen. Bereits kleine Lageänderungen beeinflussen die </w:t>
-      </w:r>
-      <w:r>
-        <w:rPr>
-          <w:lang w:val="de-DE"/>
-        </w:rPr>
-        <w:lastRenderedPageBreak/>
-        <w:t xml:space="preserve">Umrechnung der Kameramessung in das Bezugssystem </w:t>
-      </w:r>
-      <w:proofErr w:type="spellStart"/>
-      <w:r>
-        <w:rPr>
-          <w:lang w:val="de-DE"/>
-        </w:rPr>
-        <w:t>world</w:t>
-      </w:r>
-      <w:proofErr w:type="spellEnd"/>
-      <w:r>
-        <w:rPr>
-          <w:lang w:val="de-DE"/>
-        </w:rPr>
-        <w:t xml:space="preserve">. Deshalb ist ein einfach ausführbares und wiederholbares Kalibrierverfahren für den Aufbau erforderlich. </w:t>
-      </w:r>
-      <w:r>
-        <w:t xml:space="preserve">Das </w:t>
-      </w:r>
-      <w:proofErr w:type="spellStart"/>
-      <w:r>
-        <w:t>Kalibrierverfahren</w:t>
-      </w:r>
-      <w:proofErr w:type="spellEnd"/>
-      <w:r>
-        <w:t xml:space="preserve"> </w:t>
-      </w:r>
-      <w:proofErr w:type="spellStart"/>
-      <w:r>
-        <w:t>selbst</w:t>
-      </w:r>
-      <w:proofErr w:type="spellEnd"/>
-      <w:r>
-        <w:t xml:space="preserve"> </w:t>
-      </w:r>
-      <w:proofErr w:type="spellStart"/>
-      <w:r>
-        <w:t>wird</w:t>
-      </w:r>
-      <w:proofErr w:type="spellEnd"/>
-      <w:r>
-        <w:t xml:space="preserve"> in </w:t>
-      </w:r>
-      <w:proofErr w:type="spellStart"/>
-      <w:r>
-        <w:t>Kapitel</w:t>
-      </w:r>
-      <w:proofErr w:type="spellEnd"/>
-      <w:r>
-        <w:t xml:space="preserve"> 4 </w:t>
-      </w:r>
-      <w:proofErr w:type="spellStart"/>
-      <w:r>
-        <w:t>erläutert</w:t>
-      </w:r>
-      <w:proofErr w:type="spellEnd"/>
-      <w:r>
-        <w:t xml:space="preserve"> [12].</w:t>
-      </w:r>
-      <w:r>
-        <w:t xml:space="preserve"> </w:t>
-      </w:r>
-    </w:p>
-    <w:p/>
-    <w:p>
-      <w:pPr>
-        <w:pStyle w:val="berschrift3"/>
-      </w:pPr>
-      <w:bookmarkStart w:id="28" w:name="ch_2_1_6"/>
-      <w:bookmarkStart w:id="29" w:name="_Toc241704881"/>
-      <w:r>
-        <w:t>Roboterkamera</w:t>
-      </w:r>
-      <w:bookmarkEnd w:id="28"/>
-      <w:bookmarkEnd w:id="29"/>
-    </w:p>
-    <w:p>
-      <w:pPr>
-        <w:rPr>
-          <w:lang w:val="de-DE"/>
-        </w:rPr>
-      </w:pPr>
-      <w:r>
-        <w:rPr>
-          <w:lang w:val="de-DE"/>
-        </w:rPr>
-        <w:t xml:space="preserve">Die in Abschnitt </w:t>
-      </w:r>
-      <w:r>
-        <w:fldChar w:fldCharType="begin"/>
-      </w:r>
-      <w:r>
-        <w:rPr>
-          <w:lang w:val="de-DE"/>
-        </w:rPr>
-        <w:instrText xml:space="preserve"> REF ch_2_1_1 \n \h </w:instrText>
-      </w:r>
-      <w:r>
-        <w:fldChar w:fldCharType="separate"/>
-      </w:r>
-      <w:r>
-        <w:rPr>
-          <w:lang w:val="de-DE"/>
-        </w:rPr>
-        <w:t>2.1.1</w:t>
-      </w:r>
-      <w:r>
-        <w:fldChar w:fldCharType="end"/>
-      </w:r>
-      <w:r>
-        <w:rPr>
-          <w:lang w:val="de-DE"/>
-        </w:rPr>
-        <w:t xml:space="preserve"> beschriebene Roboterkamera bewegt sich gemeinsam mit dem Flansch. Im finalen Greifablauf ist sie nicht in den aktiven Regelpfad eingebunden. Die Gründe für diese Entscheidung erläutert Abschnitt 3.1. Die für einen späteren Einsatz vorbereitete Kalibrierung der Roboterkamera beschreibt Abschnitt 4.3 [13].</w:t>
-      </w:r>
-      <w:r>
-        <w:rPr>
-          <w:lang w:val="de-DE"/>
-        </w:rPr>
-        <w:t xml:space="preserve"> </w:t>
-      </w:r>
-    </w:p>
-    <w:p>
-      <w:pPr>
-        <w:rPr>
-          <w:lang w:val="de-DE"/>
-        </w:rPr>
-      </w:pPr>
-    </w:p>
-    <w:p>
-      <w:pPr>
-        <w:pStyle w:val="berschrift2"/>
-      </w:pPr>
-      <w:bookmarkStart w:id="30" w:name="ch_2_2"/>
-      <w:bookmarkStart w:id="31" w:name="_Toc241704882"/>
-      <w:proofErr w:type="spellStart"/>
-      <w:r>
-        <w:t>Koordinatensysteme</w:t>
-      </w:r>
-      <w:proofErr w:type="spellEnd"/>
-      <w:r>
-        <w:t xml:space="preserve"> und </w:t>
-      </w:r>
-      <w:proofErr w:type="spellStart"/>
-      <w:r>
-        <w:t>Greifgeometrie</w:t>
-      </w:r>
-      <w:bookmarkEnd w:id="30"/>
-      <w:bookmarkEnd w:id="31"/>
-      <w:proofErr w:type="spellEnd"/>
-    </w:p>
-    <w:p>
-      <w:pPr>
-        <w:pStyle w:val="berschrift3"/>
-        <w:rPr>
-          <w:lang w:val="de-DE"/>
-        </w:rPr>
-      </w:pPr>
-      <w:bookmarkStart w:id="32" w:name="ch_2_2_1"/>
-      <w:bookmarkStart w:id="33" w:name="_Toc241704883"/>
-      <w:r>
-        <w:rPr>
-          <w:lang w:val="de-DE"/>
-        </w:rPr>
-        <w:t xml:space="preserve">Bezugssystem </w:t>
-      </w:r>
-      <w:proofErr w:type="spellStart"/>
-      <w:r>
-        <w:rPr>
-          <w:lang w:val="de-DE"/>
-        </w:rPr>
-        <w:t>world</w:t>
-      </w:r>
-      <w:proofErr w:type="spellEnd"/>
-      <w:r>
-        <w:rPr>
-          <w:lang w:val="de-DE"/>
-        </w:rPr>
-        <w:t>, Roboterbasis und Flansch ur_tool0</w:t>
-      </w:r>
-      <w:bookmarkEnd w:id="32"/>
-      <w:bookmarkEnd w:id="33"/>
-    </w:p>
-    <w:p>
-      <w:pPr>
-        <w:rPr>
-          <w:lang w:val="de-DE"/>
-        </w:rPr>
-      </w:pPr>
-      <w:r>
-        <w:rPr>
-          <w:lang w:val="de-DE"/>
-        </w:rPr>
-        <w:t xml:space="preserve">Alle Positionsangaben des Regelpfads beziehen sich auf das globale Bezugssystem </w:t>
-      </w:r>
-      <w:proofErr w:type="spellStart"/>
-      <w:r>
-        <w:rPr>
-          <w:lang w:val="de-DE"/>
-        </w:rPr>
-        <w:t>world</w:t>
-      </w:r>
-      <w:proofErr w:type="spellEnd"/>
-      <w:r>
-        <w:rPr>
-          <w:lang w:val="de-DE"/>
-        </w:rPr>
-        <w:t xml:space="preserve"> (Abschnitt </w:t>
-      </w:r>
-      <w:r>
-        <w:fldChar w:fldCharType="begin"/>
-      </w:r>
-      <w:r>
-        <w:rPr>
-          <w:lang w:val="de-DE"/>
-        </w:rPr>
-        <w:instrText xml:space="preserve"> REF ch_2_1_1 \n \h </w:instrText>
-      </w:r>
-      <w:r>
-        <w:fldChar w:fldCharType="separate"/>
-      </w:r>
-      <w:r>
-        <w:rPr>
-          <w:lang w:val="de-DE"/>
-        </w:rPr>
-        <w:t>2.1.1</w:t>
-      </w:r>
-      <w:r>
-        <w:fldChar w:fldCharType="end"/>
-      </w:r>
-      <w:r>
-        <w:rPr>
-          <w:lang w:val="de-DE"/>
-        </w:rPr>
-        <w:t xml:space="preserve">). Das System ist fest mit dem Roboter verbunden und bewegt sich nicht mit dem Förderband. Die Förderbewegung erfolgt im Aufbau näherungsweise in negative Y-Richtung von </w:t>
-      </w:r>
-      <w:proofErr w:type="spellStart"/>
-      <w:r>
-        <w:rPr>
-          <w:lang w:val="de-DE"/>
-        </w:rPr>
-        <w:t>world</w:t>
-      </w:r>
-      <w:proofErr w:type="spellEnd"/>
-      <w:r>
-        <w:rPr>
-          <w:lang w:val="de-DE"/>
-        </w:rPr>
-        <w:t>. Das Förderband liegt gemäß Abbildung 3 seitlich der Roboterbasis im Bereich negativer X-Koordinaten. Die Z-Achse zeigt nach oben. Die Bandoberfläche liegt bei z = 0,054 m [14].</w:t>
-      </w:r>
-    </w:p>
-    <w:p>
-      <w:pPr>
-        <w:rPr>
-          <w:lang w:val="de-DE"/>
-        </w:rPr>
-      </w:pPr>
-      <w:r>
-        <w:rPr>
-          <w:lang w:val="de-DE"/>
-        </w:rPr>
-        <w:t xml:space="preserve">Das Bezugssystem </w:t>
-      </w:r>
-      <w:proofErr w:type="spellStart"/>
-      <w:r>
-        <w:rPr>
-          <w:lang w:val="de-DE"/>
-        </w:rPr>
-        <w:t>conveyor_frame</w:t>
-      </w:r>
-      <w:proofErr w:type="spellEnd"/>
-      <w:r>
-        <w:rPr>
-          <w:lang w:val="de-DE"/>
-        </w:rPr>
-        <w:t xml:space="preserve"> aus Abschnitt </w:t>
-      </w:r>
-      <w:r>
-        <w:fldChar w:fldCharType="begin"/>
-      </w:r>
-      <w:r>
-        <w:rPr>
-          <w:lang w:val="de-DE"/>
-        </w:rPr>
-        <w:instrText xml:space="preserve"> REF ch_2_1_1 \n \h </w:instrText>
-      </w:r>
-      <w:r>
-        <w:fldChar w:fldCharType="separate"/>
-      </w:r>
-      <w:r>
-        <w:rPr>
-          <w:lang w:val="de-DE"/>
-        </w:rPr>
-        <w:t>2.1.1</w:t>
-      </w:r>
-      <w:r>
-        <w:fldChar w:fldCharType="end"/>
-      </w:r>
-      <w:r>
-        <w:rPr>
-          <w:lang w:val="de-DE"/>
-        </w:rPr>
-        <w:t xml:space="preserve"> wird im finalen Betrieb nicht verwendet. Dadurch entfällt im Regelpfad eine zusätzliche Umrechnung zwischen Band und Roboter.</w:t>
-      </w:r>
-      <w:r>
-        <w:rPr>
-          <w:lang w:val="de-DE"/>
-        </w:rPr>
-        <w:t xml:space="preserve"> </w:t>
-      </w:r>
-      <w:r>
-        <w:rPr>
-          <w:lang w:val="de-DE"/>
-        </w:rPr>
-        <w:t>Die Robotersteuerung liefert als geregelte Pose die Lage des Flansches ur_tool0. Sie ist von einem in der UR-Steuerung konfigurierten TCP zu unterscheiden. Die daraus folgende Lage des tatsächlichen Griffpunkts wird im nächsten Abschnitt bestimmt. Die räumliche Zuordnung von Roboterbasis, Flansch ur_tool0 und Griffpunkt zeigt Abbildung 6.</w:t>
-      </w:r>
-    </w:p>
-    <w:p>
-      <w:pPr>
-        <w:jc w:val="center"/>
-      </w:pPr>
-      <w:r>
-        <w:rPr>
-          <w:noProof/>
-        </w:rPr>
-        <w:drawing>
-          <wp:inline distT="0" distB="0" distL="0" distR="0" wp14:anchorId="46118D63" wp14:editId="2A69F6E4">
-            <wp:extent cx="5580000" cy="2703392"/>
-            <wp:effectExtent l="0" t="0" r="0" b="0"/>
-            <wp:docPr id="755115076" name="Picture 755115076"/>
             <wp:cNvGraphicFramePr>
               <a:graphicFrameLocks xmlns:a="http://schemas.openxmlformats.org/drawingml/2006/main" noChangeAspect="1"/>
             </wp:cNvGraphicFramePr>
@@ -8691,6 +8201,620 @@
                   <pic:spPr>
                     <a:xfrm>
                       <a:off x="0" y="0"/>
+                      <a:ext cx="5580000" cy="5083117"/>
+                    </a:xfrm>
+                    <a:prstGeom prst="rect">
+                      <a:avLst/>
+                    </a:prstGeom>
+                  </pic:spPr>
+                </pic:pic>
+              </a:graphicData>
+            </a:graphic>
+          </wp:inline>
+        </w:drawing>
+      </w:r>
+    </w:p>
+    <w:p>
+      <w:pPr>
+        <w:pStyle w:val="Beschriftung"/>
+        <w:jc w:val="center"/>
+        <w:rPr>
+          <w:lang w:val="de-DE"/>
+        </w:rPr>
+      </w:pPr>
+      <w:r>
+        <w:rPr>
+          <w:lang w:val="de-DE"/>
+        </w:rPr>
+        <w:t>Abbildung 5: Herstellerabmessungen des geöffneten Robotiq-2F-140-Greifers (Quelle: [9]).</w:t>
+      </w:r>
+    </w:p>
+    <w:p>
+      <w:pPr>
+        <w:rPr>
+          <w:lang w:val="de-DE"/>
+        </w:rPr>
+      </w:pPr>
+      <w:r>
+        <w:rPr>
+          <w:lang w:val="de-DE"/>
+        </w:rPr>
+        <w:t>Jeder Finger besteht aus zwei starren Abschnitten. Diese Abschnitte werden Phalangen genannt und sind über ein Gelenk verbunden. Ein einziger Antrieb bewegt beide Finger. Der Greifer besitzt damit weniger Antriebe als Gelenke. Beim Schließen drehen sich die Phalangen um ihre Gelenke. Die Greifflächen folgen deshalb einer gekrümmten Bahn und nicht einer geraden parallelen Bewegung. Abhängig von Geometrie und Lage des Klotzes entsteht ein paralleler oder umschließender Griff [10].</w:t>
+      </w:r>
+    </w:p>
+    <w:p>
+      <w:pPr>
+        <w:rPr>
+          <w:lang w:val="de-DE"/>
+        </w:rPr>
+      </w:pPr>
+      <w:r>
+        <w:rPr>
+          <w:lang w:val="de-DE"/>
+        </w:rPr>
+        <w:t>Ein Klotz kann deshalb an seinen Seiten nicht beliebig tief gegriffen werden. Bei einem zu tiefen seitlichen Eingriff würden die Phalangen beim Schließen mit der Oberseite des Klotzes kollidieren. Die Greiftiefe ist somit durch die Fingergeometrie begrenzt. Außerdem verändert sich die räumliche Höhe des Greifers zwischen offenem und geschlossenem Zustand. Der zulässige Arbeitsraum und die Greifhöhe müssen diese Zustandsänderung berücksichtigen.</w:t>
+      </w:r>
+    </w:p>
+    <w:p>
+      <w:pPr>
+        <w:rPr>
+          <w:lang w:val="de-DE"/>
+        </w:rPr>
+      </w:pPr>
+      <w:r>
+        <w:rPr>
+          <w:lang w:val="de-DE"/>
+        </w:rPr>
+        <w:t xml:space="preserve">Schließgeschwindigkeit und Schließkraft sind einstellbar. Der Kraftwert begrenzt den maximalen Motorstrom und damit die beim Schließen verfügbare Greifkraft. Treffen die Finger auf einen Widerstand und wird diese Grenze erreicht, hält der Greifer an. Sein Gerätestatus meldet den Kontakt als erkannte Objektaufnahme. Bei geeigneter Kraftkonfiguration kann die </w:t>
+      </w:r>
+      <w:r>
+        <w:rPr>
+          <w:lang w:val="de-DE"/>
+        </w:rPr>
+        <w:lastRenderedPageBreak/>
+        <w:t>integrierte Nachgreiffunktion einen späteren Objektverlust erkennen und die Finger weiter schließen [10].</w:t>
+      </w:r>
+    </w:p>
+    <w:p>
+      <w:pPr>
+        <w:rPr>
+          <w:lang w:val="de-DE"/>
+        </w:rPr>
+      </w:pPr>
+      <w:r>
+        <w:rPr>
+          <w:lang w:val="de-DE"/>
+        </w:rPr>
+        <w:t>Die tatsächlich nutzbare Öffnungsweite wurde am aufgebauten System mit 127 mm gemessen. An den Fingerendgliedern sind 3D-gedruckte Aufsätze mit Gummi-</w:t>
+      </w:r>
+      <w:proofErr w:type="spellStart"/>
+      <w:r>
+        <w:rPr>
+          <w:lang w:val="de-DE"/>
+        </w:rPr>
+        <w:t>Grippmatten</w:t>
+      </w:r>
+      <w:proofErr w:type="spellEnd"/>
+      <w:r>
+        <w:rPr>
+          <w:lang w:val="de-DE"/>
+        </w:rPr>
+        <w:t xml:space="preserve"> montiert. Die Greiffläche jeder Matte beträgt 20 mm × 15 mm.</w:t>
+      </w:r>
+    </w:p>
+    <w:p>
+      <w:pPr>
+        <w:rPr>
+          <w:lang w:val="de-DE"/>
+        </w:rPr>
+      </w:pPr>
+      <w:r>
+        <w:rPr>
+          <w:lang w:val="de-DE"/>
+        </w:rPr>
+        <w:t>Vor dem Betrieb wird der Öffnungsbereich des Greifers kalibriert. Dadurch ist die Öffnungsweite im aufgebauten System als Millimeterwert verfügbar. Der Greifer ist über USB mit dem Rechner verbunden. Er wird damit extern angesteuert und nicht über die direkte Roboteransteuerung bedient.</w:t>
+      </w:r>
+      <w:r>
+        <w:rPr>
+          <w:lang w:val="de-DE"/>
+        </w:rPr>
+        <w:t xml:space="preserve"> </w:t>
+      </w:r>
+    </w:p>
+    <w:p>
+      <w:pPr>
+        <w:rPr>
+          <w:lang w:val="de-DE"/>
+        </w:rPr>
+      </w:pPr>
+    </w:p>
+    <w:p>
+      <w:pPr>
+        <w:pStyle w:val="berschrift3"/>
+      </w:pPr>
+      <w:bookmarkStart w:id="24" w:name="ch_2_1_4"/>
+      <w:bookmarkStart w:id="25" w:name="_Toc241704879"/>
+      <w:proofErr w:type="spellStart"/>
+      <w:r>
+        <w:t>Förderband</w:t>
+      </w:r>
+      <w:proofErr w:type="spellEnd"/>
+      <w:r>
+        <w:t xml:space="preserve"> und </w:t>
+      </w:r>
+      <w:proofErr w:type="spellStart"/>
+      <w:r>
+        <w:t>Klötze</w:t>
+      </w:r>
+      <w:bookmarkEnd w:id="24"/>
+      <w:bookmarkEnd w:id="25"/>
+      <w:proofErr w:type="spellEnd"/>
+    </w:p>
+    <w:p>
+      <w:pPr>
+        <w:rPr>
+          <w:lang w:val="de-DE"/>
+        </w:rPr>
+      </w:pPr>
+      <w:r>
+        <w:rPr>
+          <w:lang w:val="de-DE"/>
+        </w:rPr>
+        <w:t>Das Förderband führt die Klötze vom manuellen Auflagepunkt am Bandanfang durch den Erfassungsbereich der Basiskamera zur Greifzone. Die Geschwindigkeit bleibt während eines Versuchs konstant. Vor Versuchsbeginn können verschiedene Geschwindigkeitsstufen eingestellt werden. Eine Stoppuhrmessung der niedrigsten Einstellung, Stufe 1, ergab Werte zwischen 125 mm/s und 133 mm/s [11]. Die gemessene Geschwindigkeit dient später als Gegenprobe für die aus den Bilddaten geschätzte Bandgeschwindigkeit.</w:t>
+      </w:r>
+    </w:p>
+    <w:p>
+      <w:pPr>
+        <w:rPr>
+          <w:lang w:val="de-DE"/>
+        </w:rPr>
+      </w:pPr>
+      <w:r>
+        <w:rPr>
+          <w:lang w:val="de-DE"/>
+        </w:rPr>
+        <w:t>Für die Versuche wurden ausschließlich quaderförmige, 3D-gedruckte Klötze verwendet. Der am häufigsten verwendete flache Klotz besitzt die Abmessungen 25 mm × 50 mm × 75 mm. Daneben kamen ein großer Quader mit 100 mm × 50 mm × 50 mm sowie Würfel mit einer Kantenlänge von 50 mm zum Einsatz. Die Klötze sind rot, blau, weiß oder schwarz. Ihre Oberseiten sind überwiegend matt, während einzelne Seitenflächen stärker reflektieren [11].</w:t>
+      </w:r>
+    </w:p>
+    <w:p>
+      <w:pPr>
+        <w:rPr>
+          <w:lang w:val="de-DE"/>
+        </w:rPr>
+      </w:pPr>
+      <w:r>
+        <w:rPr>
+          <w:lang w:val="de-DE"/>
+        </w:rPr>
+        <w:t>Die Klötze können stehend, liegend, flach oder gedreht auf dem Band liegen. Runde Klötze wurden bewusst ausgeschlossen. Ihre Orientierung lässt sich mit dem gewählten Ansatz nicht eindeutig erfassen und ist für den vorgesehenen Greifablauf nicht erforderlich. Die verwendeten Geometrien begrenzen den Funktionsnachweis damit auf quaderförmige Objekte.</w:t>
+      </w:r>
+      <w:r>
+        <w:rPr>
+          <w:lang w:val="de-DE"/>
+        </w:rPr>
+        <w:t xml:space="preserve"> </w:t>
+      </w:r>
+    </w:p>
+    <w:p>
+      <w:pPr>
+        <w:rPr>
+          <w:lang w:val="de-DE"/>
+        </w:rPr>
+      </w:pPr>
+    </w:p>
+    <w:p>
+      <w:pPr>
+        <w:pStyle w:val="berschrift3"/>
+      </w:pPr>
+      <w:bookmarkStart w:id="26" w:name="ch_2_1_5"/>
+      <w:bookmarkStart w:id="27" w:name="_Toc241704880"/>
+      <w:r>
+        <w:t>Basiskamera</w:t>
+      </w:r>
+      <w:bookmarkEnd w:id="26"/>
+      <w:bookmarkEnd w:id="27"/>
+    </w:p>
+    <w:p>
+      <w:pPr>
+        <w:rPr>
+          <w:lang w:val="de-DE"/>
+        </w:rPr>
+      </w:pPr>
+      <w:r>
+        <w:rPr>
+          <w:lang w:val="de-DE"/>
+        </w:rPr>
+        <w:t>Die Basiskamera ist die zentrale Sensorik des finalen Greifablaufs. Die L515 liefert ein RGB-Bild mit 1.280 × 720 Pixel bei 15 Hz und ein Tiefenbild mit 640 × 480 Pixel bei 30 Hz. Die unterschiedliche Rate ergibt sich aus dem verwendeten Tiefenprofil der L515 [12].</w:t>
+      </w:r>
+    </w:p>
+    <w:p>
+      <w:pPr>
+        <w:rPr>
+          <w:lang w:val="de-DE"/>
+        </w:rPr>
+      </w:pPr>
+      <w:r>
+        <w:rPr>
+          <w:lang w:val="de-DE"/>
+        </w:rPr>
+        <w:t xml:space="preserve">Der sichtbare Bandbereich reicht im Bezugssystem </w:t>
+      </w:r>
+      <w:proofErr w:type="spellStart"/>
+      <w:r>
+        <w:rPr>
+          <w:lang w:val="de-DE"/>
+        </w:rPr>
+        <w:t>world</w:t>
+      </w:r>
+      <w:proofErr w:type="spellEnd"/>
+      <w:r>
+        <w:rPr>
+          <w:lang w:val="de-DE"/>
+        </w:rPr>
+        <w:t xml:space="preserve"> ungefähr von y = +1,03 m bis y = +0,46 m. Die Greifzone beginnt unmittelbar hinter diesem Bildbereich. Der Roboter und sein Greifer verdecken die Kamera damit während des Greifvorgangs nicht. Die weitere Führung eines erkannten Klotzes bis zur Greifzone wird erst im Kapitel zum Greifkonzept beschrieben.</w:t>
+      </w:r>
+    </w:p>
+    <w:p>
+      <w:r>
+        <w:rPr>
+          <w:lang w:val="de-DE"/>
+        </w:rPr>
+        <w:t xml:space="preserve">Das Gestell der Kamera ist nicht ausreichend steif, um ihre Lage nach Änderungen am Aufbau dauerhaft als unveränderlich anzunehmen. Bereits kleine Lageänderungen beeinflussen die </w:t>
+      </w:r>
+      <w:r>
+        <w:rPr>
+          <w:lang w:val="de-DE"/>
+        </w:rPr>
+        <w:lastRenderedPageBreak/>
+        <w:t xml:space="preserve">Umrechnung der Kameramessung in das Bezugssystem </w:t>
+      </w:r>
+      <w:proofErr w:type="spellStart"/>
+      <w:r>
+        <w:rPr>
+          <w:lang w:val="de-DE"/>
+        </w:rPr>
+        <w:t>world</w:t>
+      </w:r>
+      <w:proofErr w:type="spellEnd"/>
+      <w:r>
+        <w:rPr>
+          <w:lang w:val="de-DE"/>
+        </w:rPr>
+        <w:t xml:space="preserve">. Deshalb ist ein einfach ausführbares und wiederholbares Kalibrierverfahren für den Aufbau erforderlich. </w:t>
+      </w:r>
+      <w:r>
+        <w:t xml:space="preserve">Das </w:t>
+      </w:r>
+      <w:proofErr w:type="spellStart"/>
+      <w:r>
+        <w:t>Kalibrierverfahren</w:t>
+      </w:r>
+      <w:proofErr w:type="spellEnd"/>
+      <w:r>
+        <w:t xml:space="preserve"> </w:t>
+      </w:r>
+      <w:proofErr w:type="spellStart"/>
+      <w:r>
+        <w:t>selbst</w:t>
+      </w:r>
+      <w:proofErr w:type="spellEnd"/>
+      <w:r>
+        <w:t xml:space="preserve"> </w:t>
+      </w:r>
+      <w:proofErr w:type="spellStart"/>
+      <w:r>
+        <w:t>wird</w:t>
+      </w:r>
+      <w:proofErr w:type="spellEnd"/>
+      <w:r>
+        <w:t xml:space="preserve"> in </w:t>
+      </w:r>
+      <w:proofErr w:type="spellStart"/>
+      <w:r>
+        <w:t>Kapitel</w:t>
+      </w:r>
+      <w:proofErr w:type="spellEnd"/>
+      <w:r>
+        <w:t xml:space="preserve"> 4 </w:t>
+      </w:r>
+      <w:proofErr w:type="spellStart"/>
+      <w:r>
+        <w:t>erläutert</w:t>
+      </w:r>
+      <w:proofErr w:type="spellEnd"/>
+      <w:r>
+        <w:t xml:space="preserve"> [12].</w:t>
+      </w:r>
+      <w:r>
+        <w:t xml:space="preserve"> </w:t>
+      </w:r>
+    </w:p>
+    <w:p/>
+    <w:p>
+      <w:pPr>
+        <w:pStyle w:val="berschrift3"/>
+      </w:pPr>
+      <w:bookmarkStart w:id="28" w:name="ch_2_1_6"/>
+      <w:bookmarkStart w:id="29" w:name="_Toc241704881"/>
+      <w:r>
+        <w:t>Roboterkamera</w:t>
+      </w:r>
+      <w:bookmarkEnd w:id="28"/>
+      <w:bookmarkEnd w:id="29"/>
+    </w:p>
+    <w:p>
+      <w:pPr>
+        <w:rPr>
+          <w:lang w:val="de-DE"/>
+        </w:rPr>
+      </w:pPr>
+      <w:r>
+        <w:rPr>
+          <w:lang w:val="de-DE"/>
+        </w:rPr>
+        <w:t xml:space="preserve">Die in Abschnitt </w:t>
+      </w:r>
+      <w:r>
+        <w:fldChar w:fldCharType="begin"/>
+      </w:r>
+      <w:r>
+        <w:rPr>
+          <w:lang w:val="de-DE"/>
+        </w:rPr>
+        <w:instrText xml:space="preserve"> REF ch_2_1_1 \n \h </w:instrText>
+      </w:r>
+      <w:r>
+        <w:fldChar w:fldCharType="separate"/>
+      </w:r>
+      <w:r>
+        <w:rPr>
+          <w:lang w:val="de-DE"/>
+        </w:rPr>
+        <w:t>2.1.1</w:t>
+      </w:r>
+      <w:r>
+        <w:fldChar w:fldCharType="end"/>
+      </w:r>
+      <w:r>
+        <w:rPr>
+          <w:lang w:val="de-DE"/>
+        </w:rPr>
+        <w:t xml:space="preserve"> beschriebene Roboterkamera bewegt sich gemeinsam mit dem Flansch. Im finalen Greifablauf ist sie nicht in den aktiven Regelpfad eingebunden. Die Gründe für diese Entscheidung erläutert Abschnitt 3.1. Die für einen späteren Einsatz vorbereitete Kalibrierung der Roboterkamera beschreibt Abschnitt 4.3 [13].</w:t>
+      </w:r>
+      <w:r>
+        <w:rPr>
+          <w:lang w:val="de-DE"/>
+        </w:rPr>
+        <w:t xml:space="preserve"> </w:t>
+      </w:r>
+    </w:p>
+    <w:p>
+      <w:pPr>
+        <w:rPr>
+          <w:lang w:val="de-DE"/>
+        </w:rPr>
+      </w:pPr>
+    </w:p>
+    <w:p>
+      <w:pPr>
+        <w:pStyle w:val="berschrift2"/>
+      </w:pPr>
+      <w:bookmarkStart w:id="30" w:name="ch_2_2"/>
+      <w:bookmarkStart w:id="31" w:name="_Toc241704882"/>
+      <w:proofErr w:type="spellStart"/>
+      <w:r>
+        <w:t>Koordinatensysteme</w:t>
+      </w:r>
+      <w:proofErr w:type="spellEnd"/>
+      <w:r>
+        <w:t xml:space="preserve"> und </w:t>
+      </w:r>
+      <w:proofErr w:type="spellStart"/>
+      <w:r>
+        <w:t>Greifgeometrie</w:t>
+      </w:r>
+      <w:bookmarkEnd w:id="30"/>
+      <w:bookmarkEnd w:id="31"/>
+      <w:proofErr w:type="spellEnd"/>
+    </w:p>
+    <w:p>
+      <w:pPr>
+        <w:pStyle w:val="berschrift3"/>
+        <w:rPr>
+          <w:lang w:val="de-DE"/>
+        </w:rPr>
+      </w:pPr>
+      <w:bookmarkStart w:id="32" w:name="ch_2_2_1"/>
+      <w:bookmarkStart w:id="33" w:name="_Toc241704883"/>
+      <w:r>
+        <w:rPr>
+          <w:lang w:val="de-DE"/>
+        </w:rPr>
+        <w:t xml:space="preserve">Bezugssystem </w:t>
+      </w:r>
+      <w:proofErr w:type="spellStart"/>
+      <w:r>
+        <w:rPr>
+          <w:lang w:val="de-DE"/>
+        </w:rPr>
+        <w:t>world</w:t>
+      </w:r>
+      <w:proofErr w:type="spellEnd"/>
+      <w:r>
+        <w:rPr>
+          <w:lang w:val="de-DE"/>
+        </w:rPr>
+        <w:t>, Roboterbasis und Flansch ur_tool0</w:t>
+      </w:r>
+      <w:bookmarkEnd w:id="32"/>
+      <w:bookmarkEnd w:id="33"/>
+    </w:p>
+    <w:p>
+      <w:pPr>
+        <w:rPr>
+          <w:lang w:val="de-DE"/>
+        </w:rPr>
+      </w:pPr>
+      <w:r>
+        <w:rPr>
+          <w:lang w:val="de-DE"/>
+        </w:rPr>
+        <w:t xml:space="preserve">Alle Positionsangaben des Regelpfads beziehen sich auf das globale Bezugssystem </w:t>
+      </w:r>
+      <w:proofErr w:type="spellStart"/>
+      <w:r>
+        <w:rPr>
+          <w:lang w:val="de-DE"/>
+        </w:rPr>
+        <w:t>world</w:t>
+      </w:r>
+      <w:proofErr w:type="spellEnd"/>
+      <w:r>
+        <w:rPr>
+          <w:lang w:val="de-DE"/>
+        </w:rPr>
+        <w:t xml:space="preserve"> (Abschnitt </w:t>
+      </w:r>
+      <w:r>
+        <w:fldChar w:fldCharType="begin"/>
+      </w:r>
+      <w:r>
+        <w:rPr>
+          <w:lang w:val="de-DE"/>
+        </w:rPr>
+        <w:instrText xml:space="preserve"> REF ch_2_1_1 \n \h </w:instrText>
+      </w:r>
+      <w:r>
+        <w:fldChar w:fldCharType="separate"/>
+      </w:r>
+      <w:r>
+        <w:rPr>
+          <w:lang w:val="de-DE"/>
+        </w:rPr>
+        <w:t>2.1.1</w:t>
+      </w:r>
+      <w:r>
+        <w:fldChar w:fldCharType="end"/>
+      </w:r>
+      <w:r>
+        <w:rPr>
+          <w:lang w:val="de-DE"/>
+        </w:rPr>
+        <w:t xml:space="preserve">). Das System ist fest mit dem Roboter verbunden und bewegt sich nicht mit dem Förderband. Die Förderbewegung erfolgt im Aufbau näherungsweise in negative Y-Richtung von </w:t>
+      </w:r>
+      <w:proofErr w:type="spellStart"/>
+      <w:r>
+        <w:rPr>
+          <w:lang w:val="de-DE"/>
+        </w:rPr>
+        <w:t>world</w:t>
+      </w:r>
+      <w:proofErr w:type="spellEnd"/>
+      <w:r>
+        <w:rPr>
+          <w:lang w:val="de-DE"/>
+        </w:rPr>
+        <w:t>. Das Förderband liegt gemäß Abbildung 3 seitlich der Roboterbasis im Bereich negativer X-Koordinaten. Die Z-Achse zeigt nach oben. Die Bandoberfläche liegt bei z = 0,054 m [14].</w:t>
+      </w:r>
+    </w:p>
+    <w:p>
+      <w:pPr>
+        <w:rPr>
+          <w:lang w:val="de-DE"/>
+        </w:rPr>
+      </w:pPr>
+      <w:r>
+        <w:rPr>
+          <w:lang w:val="de-DE"/>
+        </w:rPr>
+        <w:t xml:space="preserve">Das Bezugssystem </w:t>
+      </w:r>
+      <w:proofErr w:type="spellStart"/>
+      <w:r>
+        <w:rPr>
+          <w:lang w:val="de-DE"/>
+        </w:rPr>
+        <w:t>conveyor_frame</w:t>
+      </w:r>
+      <w:proofErr w:type="spellEnd"/>
+      <w:r>
+        <w:rPr>
+          <w:lang w:val="de-DE"/>
+        </w:rPr>
+        <w:t xml:space="preserve"> aus Abschnitt </w:t>
+      </w:r>
+      <w:r>
+        <w:fldChar w:fldCharType="begin"/>
+      </w:r>
+      <w:r>
+        <w:rPr>
+          <w:lang w:val="de-DE"/>
+        </w:rPr>
+        <w:instrText xml:space="preserve"> REF ch_2_1_1 \n \h </w:instrText>
+      </w:r>
+      <w:r>
+        <w:fldChar w:fldCharType="separate"/>
+      </w:r>
+      <w:r>
+        <w:rPr>
+          <w:lang w:val="de-DE"/>
+        </w:rPr>
+        <w:t>2.1.1</w:t>
+      </w:r>
+      <w:r>
+        <w:fldChar w:fldCharType="end"/>
+      </w:r>
+      <w:r>
+        <w:rPr>
+          <w:lang w:val="de-DE"/>
+        </w:rPr>
+        <w:t xml:space="preserve"> wird im finalen Betrieb nicht verwendet. Dadurch entfällt im Regelpfad eine zusätzliche Umrechnung zwischen Band und Roboter.</w:t>
+      </w:r>
+      <w:r>
+        <w:rPr>
+          <w:lang w:val="de-DE"/>
+        </w:rPr>
+        <w:t xml:space="preserve"> </w:t>
+      </w:r>
+      <w:r>
+        <w:rPr>
+          <w:lang w:val="de-DE"/>
+        </w:rPr>
+        <w:t>Die Robotersteuerung liefert als geregelte Pose die Lage des Flansches ur_tool0. Sie ist von einem in der UR-Steuerung konfigurierten TCP zu unterscheiden. Die daraus folgende Lage des tatsächlichen Griffpunkts wird im nächsten Abschnitt bestimmt. Die räumliche Zuordnung von Roboterbasis, Flansch ur_tool0 und Griffpunkt zeigt Abbildung 6.</w:t>
+      </w:r>
+    </w:p>
+    <w:p>
+      <w:pPr>
+        <w:jc w:val="center"/>
+      </w:pPr>
+      <w:r>
+        <w:rPr>
+          <w:noProof/>
+        </w:rPr>
+        <w:drawing>
+          <wp:inline distT="0" distB="0" distL="0" distR="0" wp14:anchorId="46118D63" wp14:editId="2A69F6E4">
+            <wp:extent cx="5580000" cy="2703392"/>
+            <wp:effectExtent l="0" t="0" r="0" b="0"/>
+            <wp:docPr id="755115076" name="Picture 755115076"/>
+            <wp:cNvGraphicFramePr>
+              <a:graphicFrameLocks xmlns:a="http://schemas.openxmlformats.org/drawingml/2006/main" noChangeAspect="1"/>
+            </wp:cNvGraphicFramePr>
+            <a:graphic xmlns:a="http://schemas.openxmlformats.org/drawingml/2006/main">
+              <a:graphicData uri="http://schemas.openxmlformats.org/drawingml/2006/picture">
+                <pic:pic xmlns:pic="http://schemas.openxmlformats.org/drawingml/2006/picture">
+                  <pic:nvPicPr>
+                    <pic:cNvPr id="0" name="image.png"/>
+                    <pic:cNvPicPr/>
+                  </pic:nvPicPr>
+                  <pic:blipFill>
+                    <a:blip r:embed="rId18"/>
+                    <a:stretch>
+                      <a:fillRect/>
+                    </a:stretch>
+                  </pic:blipFill>
+                  <pic:spPr>
+                    <a:xfrm>
+                      <a:off x="0" y="0"/>
                       <a:ext cx="5580000" cy="2703392"/>
                     </a:xfrm>
                     <a:prstGeom prst="rect">
@@ -9294,10 +9418,14 @@
           <w:rFonts w:asciiTheme="majorHAnsi" w:eastAsiaTheme="majorEastAsia" w:hAnsiTheme="majorHAnsi" w:cstheme="majorBidi"/>
           <w:sz w:val="40"/>
           <w:szCs w:val="40"/>
+          <w:lang w:val="de-DE"/>
         </w:rPr>
       </w:pPr>
       <w:bookmarkStart w:id="46" w:name="ch_3"/>
       <w:r>
+        <w:rPr>
+          <w:lang w:val="de-DE"/>
+        </w:rPr>
         <w:br w:type="page"/>
       </w:r>
     </w:p>
@@ -10244,7 +10372,13 @@
         <w:rPr>
           <w:lang w:val="de-DE"/>
         </w:rPr>
-        <w:t xml:space="preserve"> wertet Farb- und Tiefenbild der Basiskamera aus. Im Tiefenbild gilt alles als Objekt, was innerhalb eines festgelegten Bildausschnitts eine Mindesthöhe über der Bandoberfläche überschreitet. Aus dem Umriss jedes Objekts wird das kleinste umschließende Rechteck bestimmt. Es liefert Mittelpunkt, Länge, Breite und Drehwinkel des Klotzes. Die Tiefe der Oberseite ergibt sich als Median über den Umriss. Randpixel, die bereits das Band messen, verfälschen die Höhe dadurch nicht. Die Farbe wird im Farbbild über den Farbton bestimmt.</w:t>
+        <w:t xml:space="preserve"> wertet Farb- und Tiefenbild der Basiskamera aus. Im Tiefenbild gilt alles als Objekt, was innerhalb eines festgelegten Bildausschnitts eine Mindesthöhe über der Bandoberfläche überschreitet. Aus dem Umriss jedes Objekts wird das kleinste umschließende Rechteck bestimmt. Es liefert Mittelpunkt, Länge, Breite und Drehwinkel des Klotzes. Die Tiefe der Oberseite ergibt sich als Median über den Umriss. Randpixel, die bereits das Band messen, verfälschen die Höhe dadurch nicht. Die Farbe wird im Farbbild über de</w:t>
+      </w:r>
+      <w:r>
+        <w:rPr>
+          <w:lang w:val="de-DE"/>
+        </w:rPr>
+        <w:t>n Farbton bestimmt.</w:t>
       </w:r>
     </w:p>
     <w:p>
@@ -10370,10 +10504,15 @@
       </w:r>
       <w:proofErr w:type="spellEnd"/>
       <w:r>
-        <w:t>- und Positionsschätzung</w:t>
+        <w:t xml:space="preserve">- und </w:t>
+      </w:r>
+      <w:proofErr w:type="spellStart"/>
+      <w:r>
+        <w:t>Positionsschätzung</w:t>
       </w:r>
       <w:bookmarkEnd w:id="54"/>
       <w:bookmarkEnd w:id="55"/>
+      <w:proofErr w:type="spellEnd"/>
     </w:p>
     <w:p>
       <w:pPr>
@@ -10636,7 +10775,13 @@
         <w:rPr>
           <w:lang w:val="de-DE"/>
         </w:rPr>
-        <w:t>Ein Klotz kommt als Ziel in Frage, wenn er drei Bedingungen erfüllt. Er muss eingeschwungen sein und seine Spur muss in die Greifzone führen. Er muss greifbar sein: Seine Höhe beträgt mindestens 20 mm, und seine Diagonale passt mit 10 mm Reserve in die Greiferöffnung von 127 mm. Die Diagonale deckt dabei jede Greifrichtung ab. Außerdem muss er rechtzeitig erreichbar sein. Die Zeit, bis der Klotz die Greifebene erreicht, muss länger sein als die Zeit, die der Roboter bis zur Freigabe des Absenkens benötigt. Diese setzt sich aus dem waagerechten Anfahrweg bei Höchstgeschwindigkeit und dem Einschwingen der Bewegung zusammen.</w:t>
+        <w:t xml:space="preserve">Ein Klotz kommt als Ziel in Frage, wenn er drei Bedingungen erfüllt. Er muss eingeschwungen sein und seine Spur muss in die Greifzone führen. Er muss greifbar sein: Seine Höhe beträgt mindestens 20 mm, und seine Diagonale passt mit 10 mm Reserve in die Greiferöffnung von 127 mm. Die Diagonale deckt dabei jede Greifrichtung ab. Außerdem muss er rechtzeitig erreichbar sein. Die Zeit, bis der Klotz die Greifebene erreicht, muss länger sein als die Zeit, die der Roboter bis zur Freigabe des Absenkens benötigt. </w:t>
+      </w:r>
+      <w:r>
+        <w:rPr>
+          <w:lang w:val="de-DE"/>
+        </w:rPr>
+        <w:t>Diese setzt sich aus dem waagerechten Anfahrweg bei Höchstgeschwindigkeit und dem Einschwingen der Bewegung zusammen.</w:t>
       </w:r>
     </w:p>
     <w:p>
@@ -10791,7 +10936,7 @@
                     <pic:cNvPicPr/>
                   </pic:nvPicPr>
                   <pic:blipFill>
-                    <a:blip r:embed="rId18"/>
+                    <a:blip r:embed="rId19"/>
                     <a:stretch>
                       <a:fillRect/>
                     </a:stretch>
@@ -10968,7 +11113,13 @@
         <w:rPr>
           <w:lang w:val="de-DE"/>
         </w:rPr>
-        <w:t xml:space="preserve"> ist die vorhergesagte Position des Klotzes, ergänzt um einen Vorhalt in Bandrichtung (Abschnitt 3.5.1). Liegt der Klotz noch vor der Greifzone, wartet der Flansch am Zonenrand auf der Spur des Klotzes in Bandrichtung. Sobald der Klotz die Greifzone erreicht, folgt der Flansch ihm (FOLGEN). Dabei dreht sich der Greifer in den Winkel des Klotzes. Ein Quader kann über beide Seitenpaare gegriffen werden. Eine Drehung um höchstens ±45° genügt deshalb für jede Lage und stellt sicher, dass der vorhandene Kameraaufbau nicht beschädigt wird.</w:t>
+        <w:t xml:space="preserve"> ist die vorhergesagte Position des Klotzes, ergänzt um einen Vorhalt in Bandrichtung (Abschnitt 3.5.1). Liegt der Klotz noch vor der Greifzone, wartet der Flansch am Zonenrand auf der Spur des Klotzes in Bandrichtung. Sobald der Klotz die Greifzone erreicht, folgt der Flansch ihm (FOLGEN). Dabei dreht sich der Greifer in den Winkel des Klotzes. Ein Quader kann über beide Seitenpaare gegriffen werden. Eine Drehung um höchstens ±45° genügt deshalb für jede Lage und stellt sicher, dass der vorhandene Kameraau</w:t>
+      </w:r>
+      <w:r>
+        <w:rPr>
+          <w:lang w:val="de-DE"/>
+        </w:rPr>
+        <w:t>fbau nicht beschädigt wird.</w:t>
       </w:r>
     </w:p>
     <w:p>
@@ -11384,7 +11535,15 @@
       </w:r>
       <w:proofErr w:type="spellEnd"/>
       <w:r>
-        <w:t xml:space="preserve"> berücksichtigt der </w:t>
+        <w:t xml:space="preserve"> </w:t>
+      </w:r>
+      <w:proofErr w:type="spellStart"/>
+      <w:r>
+        <w:t>berücksichtigt</w:t>
+      </w:r>
+      <w:proofErr w:type="spellEnd"/>
+      <w:r>
+        <w:t xml:space="preserve"> der </w:t>
       </w:r>
       <w:proofErr w:type="spellStart"/>
       <w:r>
@@ -11670,7 +11829,7 @@
                     <pic:cNvPicPr/>
                   </pic:nvPicPr>
                   <pic:blipFill>
-                    <a:blip r:embed="rId19"/>
+                    <a:blip r:embed="rId20"/>
                     <a:stretch>
                       <a:fillRect/>
                     </a:stretch>
@@ -11785,7 +11944,7 @@
                     <pic:cNvPicPr/>
                   </pic:nvPicPr>
                   <pic:blipFill>
-                    <a:blip r:embed="rId20"/>
+                    <a:blip r:embed="rId21"/>
                     <a:stretch>
                       <a:fillRect/>
                     </a:stretch>
@@ -11842,10 +12001,14 @@
           <w:rFonts w:asciiTheme="majorHAnsi" w:eastAsiaTheme="majorEastAsia" w:hAnsiTheme="majorHAnsi" w:cstheme="majorBidi"/>
           <w:sz w:val="40"/>
           <w:szCs w:val="40"/>
+          <w:lang w:val="de-DE"/>
         </w:rPr>
       </w:pPr>
       <w:bookmarkStart w:id="82" w:name="ch_4"/>
       <w:r>
+        <w:rPr>
+          <w:lang w:val="de-DE"/>
+        </w:rPr>
         <w:br w:type="page"/>
       </w:r>
     </w:p>
@@ -12363,7 +12526,7 @@
                     <pic:cNvPicPr/>
                   </pic:nvPicPr>
                   <pic:blipFill>
-                    <a:blip r:embed="rId21"/>
+                    <a:blip r:embed="rId22"/>
                     <a:stretch>
                       <a:fillRect/>
                     </a:stretch>
@@ -13103,7 +13266,7 @@
                     <pic:cNvPicPr/>
                   </pic:nvPicPr>
                   <pic:blipFill>
-                    <a:blip r:embed="rId22"/>
+                    <a:blip r:embed="rId23"/>
                     <a:stretch>
                       <a:fillRect/>
                     </a:stretch>
@@ -13875,10 +14038,14 @@
           <w:rFonts w:asciiTheme="majorHAnsi" w:eastAsiaTheme="majorEastAsia" w:hAnsiTheme="majorHAnsi" w:cstheme="majorBidi"/>
           <w:sz w:val="40"/>
           <w:szCs w:val="40"/>
+          <w:lang w:val="de-DE"/>
         </w:rPr>
       </w:pPr>
       <w:bookmarkStart w:id="92" w:name="ch_5"/>
       <w:r>
+        <w:rPr>
+          <w:lang w:val="de-DE"/>
+        </w:rPr>
         <w:br w:type="page"/>
       </w:r>
     </w:p>
@@ -13946,10 +14113,15 @@
       </w:r>
       <w:proofErr w:type="spellEnd"/>
       <w:r>
-        <w:t xml:space="preserve"> des Regelpfads</w:t>
+        <w:t xml:space="preserve"> des </w:t>
+      </w:r>
+      <w:proofErr w:type="spellStart"/>
+      <w:r>
+        <w:t>Regelpfads</w:t>
       </w:r>
       <w:bookmarkEnd w:id="94"/>
       <w:bookmarkEnd w:id="95"/>
+      <w:proofErr w:type="spellEnd"/>
     </w:p>
     <w:p>
       <w:pPr>
@@ -14171,7 +14343,7 @@
                     <pic:cNvPicPr/>
                   </pic:nvPicPr>
                   <pic:blipFill>
-                    <a:blip r:embed="rId23"/>
+                    <a:blip r:embed="rId24"/>
                     <a:stretch>
                       <a:fillRect/>
                     </a:stretch>
@@ -14337,10 +14509,14 @@
           <w:rFonts w:asciiTheme="majorHAnsi" w:eastAsiaTheme="majorEastAsia" w:hAnsiTheme="majorHAnsi" w:cstheme="majorBidi"/>
           <w:sz w:val="32"/>
           <w:szCs w:val="32"/>
+          <w:lang w:val="de-DE"/>
         </w:rPr>
       </w:pPr>
       <w:bookmarkStart w:id="96" w:name="ch_5_2"/>
       <w:r>
+        <w:rPr>
+          <w:lang w:val="de-DE"/>
+        </w:rPr>
         <w:br w:type="page"/>
       </w:r>
     </w:p>
@@ -15443,7 +15619,13 @@
         <w:rPr>
           <w:lang w:val="de-DE"/>
         </w:rPr>
-        <w:t>. Die untere Grenze für die erkannte Höhe wurde auf 10 mm gesetzt. Damit bleiben auch die flachen verwendeten Klötze im Kandidatenpool. Die niedrigeren Grenzen erhöhen zugleich die Gefahr von Störungen durch Reflexionen und unvollständige Tiefenwerte. Die Beschränkung auf den erreichbaren Bildausschnitt und die zeitliche Glättung der Messwerte begrenzen diesen Effekt. Die nachgelagerte Zielauswahl bewertet weiterhin nur Objekte, die innerhalb der Greifzone liegen und rechtzeitig erreichbar sind. Die Bilderkennung muss daher nicht jedes sichtbare Objekt perfekt klassifizieren, sondern ausreichend verlässliche Messungen für die bewegungsabhängige Auswahl bereitstellen.</w:t>
+        <w:t>. Die untere Grenze für die erkannte Höhe wurde auf 10 mm gesetzt. Damit bleiben auch die flachen verwendeten Klötze im Kandidatenpool. Die niedrigeren Grenzen erhöhen zugleich die Gefahr von Störungen durch Reflexionen und unvollständige Tiefenwerte. Die Beschränkung auf den erreichbaren Bildausschnitt und die zeitliche Glättung der Messwerte begrenzen diesen Effekt. Die nachgelagerte Zielauswahl bewertet weiterhin nur Objekte, die innerhalb der Greifzone liegen und rechtzeitig erreichbar sind. Die Bilderk</w:t>
+      </w:r>
+      <w:r>
+        <w:rPr>
+          <w:lang w:val="de-DE"/>
+        </w:rPr>
+        <w:t>ennung muss daher nicht jedes sichtbare Objekt perfekt klassifizieren, sondern ausreichend verlässliche Messungen für die bewegungsabhängige Auswahl bereitstellen.</w:t>
       </w:r>
     </w:p>
     <w:p>
@@ -15486,10 +15668,14 @@
           <w:rFonts w:asciiTheme="majorHAnsi" w:eastAsiaTheme="majorEastAsia" w:hAnsiTheme="majorHAnsi" w:cstheme="majorBidi"/>
           <w:sz w:val="40"/>
           <w:szCs w:val="40"/>
+          <w:lang w:val="de-DE"/>
         </w:rPr>
       </w:pPr>
       <w:bookmarkStart w:id="100" w:name="ch_6"/>
       <w:r>
+        <w:rPr>
+          <w:lang w:val="de-DE"/>
+        </w:rPr>
         <w:br w:type="page"/>
       </w:r>
     </w:p>
@@ -15580,7 +15766,13 @@
         <w:rPr>
           <w:lang w:val="de-DE"/>
         </w:rPr>
-        <w:t>Als erfolgreicher Greifvorgang gilt, dass ein auf dem laufenden Band erkannter Klotz ausgewählt, angefahren, während der Bewegung gegriffen, angehoben und in der Ablagebox abgelegt wird. Die Dokumentation enthält Zustandsprotokolle, Beobachtungen am Aufbau und Messwerte der Regelabweichung. Die einzelnen Läufe unterscheiden sich in Geschwindigkeitsgrenzen, Zeitparametern und Bildverarbeitung. Ihre Ergebnisse dürfen daher nicht zu einer gemeinsamen Erfolgsquote addiert werden. Tabelle 5 fasst die dokumentierten Entwicklungsläufe getrennt zusammen [32].</w:t>
+        <w:t>Als erfolgreicher Greifvorgang gilt, dass ein auf dem laufenden Band erkannter Klotz ausgewählt, angefahren, während der Bewegung gegriffen, angehoben und in der Ablagebox abgelegt wird. Die Dokumentation enthält Zustandsprotokolle, Beobachtungen am Aufbau und Messwerte der Regelabweichung. Die einzelnen Läufe unterscheiden sich in Geschwindigkeitsgrenzen, Zeitparametern und Bildverarbeitung. Ihre Ergebnisse dürfen daher nicht zu einer gemeinsamen Erfolgsquote addiert werden. Tabelle 5 fasst die dokumentier</w:t>
+      </w:r>
+      <w:r>
+        <w:rPr>
+          <w:lang w:val="de-DE"/>
+        </w:rPr>
+        <w:t>ten Entwicklungsläufe getrennt zusammen [32].</w:t>
       </w:r>
     </w:p>
     <w:p>
@@ -16372,7 +16564,13 @@
         <w:rPr>
           <w:lang w:val="de-DE"/>
         </w:rPr>
-        <w:t>Der umfangreichste Dauerlauf wurde mit einer horizontalen Geschwindigkeitsgrenze von 0,500 m/s und einer Absenkgeschwindigkeit von 0,250 m/s durchgeführt. In rund zwei Minuten wurden 15 Klötze abgelegt. Ein Fehlgriff und neun durchgelaufene Klötze traten auf. Die durchgelaufenen Klötze lagen jeweils kurz hinter einem gerade gegriffenen Objekt. Der Roboter war dadurch noch mit Heben, Ablage, Öffnen oder Rückfahrt beschäftigt. Das System wählte diese Klötze nicht fehlerhaft aus, sondern konnte sie innerhalb der verbleibenden Zeit nicht mehr sicher erreichen. Der knappste erfolgreiche Griff begann 0,340 s vor der Greifebene [32].</w:t>
+        <w:t>Der umfangreichste Dauerlauf wurde mit einer horizontalen Geschwindigkeitsgrenze von 0,500 m/s und einer Absenkgeschwindigkeit von 0,250 m/s durchgeführt. In rund zwei Minuten wurden 15 Klötze abgelegt. Ein Fehlgriff und neun durchgelaufene Klötze traten auf. Die durchgelaufenen Klötze lagen jeweils kurz hinter einem gerade gegriffenen Objekt. Der Roboter war dadurch noch mit Heben, Ablage, Öffnen oder Rückfahrt beschäftigt. Das System wählte diese Klötze nicht fehlerhaft aus, sondern konnte sie innerhalb d</w:t>
+      </w:r>
+      <w:r>
+        <w:rPr>
+          <w:lang w:val="de-DE"/>
+        </w:rPr>
+        <w:t>er verbleibenden Zeit nicht mehr sicher erreichen. Der knappste erfolgreiche Griff begann 0,340 s vor der Greifebene [32].</w:t>
       </w:r>
     </w:p>
     <w:p>
@@ -16582,7 +16780,13 @@
         <w:rPr>
           <w:lang w:val="de-DE"/>
         </w:rPr>
-        <w:t>Die dokumentierten Läufe zeigen außerdem, dass das System nicht jeden sichtbaren Klotz zwingend erreichen muss. Liegt ein Klotz zu dicht hinter einem bereits gewählten Objekt, ist er wegen des laufenden Ablagezyklus nicht mehr sicher erreichbar. Er läuft dann durch, statt einen unsicheren Greifversuch zu erzwingen. Bei veralteten Messdaten oder einer nicht mehr erreichbaren Greifebene bricht der Follower kontrolliert ab. Die Korrektur der Roboter-Nutzlast und der Beschleunigungsbegrenzung beseitigte einen beim schnellen Anfahren beobachteten Schutzstopp.</w:t>
+        <w:t>Die dokumentierten Läufe zeigen außerdem, dass das System nicht jeden sichtbaren Klotz zwingend erreichen muss. Liegt ein Klotz zu dicht hinter einem bereits gewählten Objekt, ist er wegen des laufenden Ablagezyklus nicht mehr sicher erreichbar. Er läuft dann durch, statt einen unsicheren Greifversuch zu erzwingen. Bei veralteten Messdaten oder einer nicht mehr erreichbaren Greifebene bricht der Follower kontrolliert ab. Die Korrektur der Roboter-Nutzlast und der Beschleunigungsbegrenzung beseitigte einen b</w:t>
+      </w:r>
+      <w:r>
+        <w:rPr>
+          <w:lang w:val="de-DE"/>
+        </w:rPr>
+        <w:t>eim schnellen Anfahren beobachteten Schutzstopp.</w:t>
       </w:r>
     </w:p>
     <w:p>
@@ -16614,7 +16818,15 @@
       </w:r>
       <w:proofErr w:type="spellEnd"/>
       <w:r>
-        <w:t xml:space="preserve"> für diese </w:t>
+        <w:t xml:space="preserve"> für </w:t>
+      </w:r>
+      <w:proofErr w:type="spellStart"/>
+      <w:r>
+        <w:t>diese</w:t>
+      </w:r>
+      <w:proofErr w:type="spellEnd"/>
+      <w:r>
+        <w:t xml:space="preserve"> </w:t>
       </w:r>
       <w:proofErr w:type="spellStart"/>
       <w:r>
@@ -18206,7 +18418,7 @@
                     <pic:cNvPicPr/>
                   </pic:nvPicPr>
                   <pic:blipFill>
-                    <a:blip r:embed="rId24"/>
+                    <a:blip r:embed="rId25"/>
                     <a:stretch>
                       <a:fillRect/>
                     </a:stretch>
@@ -18266,7 +18478,7 @@
                     <pic:cNvPicPr/>
                   </pic:nvPicPr>
                   <pic:blipFill>
-                    <a:blip r:embed="rId25"/>
+                    <a:blip r:embed="rId26"/>
                     <a:stretch>
                       <a:fillRect/>
                     </a:stretch>
@@ -18326,7 +18538,7 @@
                     <pic:cNvPicPr/>
                   </pic:nvPicPr>
                   <pic:blipFill>
-                    <a:blip r:embed="rId26"/>
+                    <a:blip r:embed="rId27"/>
                     <a:stretch>
                       <a:fillRect/>
                     </a:stretch>
@@ -18401,7 +18613,7 @@
                     <pic:cNvPicPr/>
                   </pic:nvPicPr>
                   <pic:blipFill>
-                    <a:blip r:embed="rId27"/>
+                    <a:blip r:embed="rId28"/>
                     <a:stretch>
                       <a:fillRect/>
                     </a:stretch>
@@ -18503,7 +18715,7 @@
                     <pic:cNvPicPr/>
                   </pic:nvPicPr>
                   <pic:blipFill>
-                    <a:blip r:embed="rId28"/>
+                    <a:blip r:embed="rId29"/>
                     <a:stretch>
                       <a:fillRect/>
                     </a:stretch>
@@ -18582,10 +18794,10 @@
       </w:r>
     </w:p>
     <w:sectPr>
-      <w:headerReference w:type="even" r:id="rId29"/>
-      <w:headerReference w:type="default" r:id="rId30"/>
-      <w:footerReference w:type="even" r:id="rId31"/>
-      <w:footerReference w:type="default" r:id="rId32"/>
+      <w:headerReference w:type="even" r:id="rId30"/>
+      <w:headerReference w:type="default" r:id="rId31"/>
+      <w:footerReference w:type="even" r:id="rId32"/>
+      <w:footerReference w:type="default" r:id="rId33"/>
       <w:pgSz w:w="11906" w:h="16838"/>
       <w:pgMar w:top="1843" w:right="1417" w:bottom="1134" w:left="1417" w:header="708" w:footer="419" w:gutter="0"/>
       <w:cols w:space="708"/>
@@ -18633,6 +18845,7 @@
           <w:docPartUnique/>
         </w:docPartObj>
       </w:sdtPr>
+      <w:sdtEndPr/>
       <w:sdtContent>
         <w:r>
           <w:fldChar w:fldCharType="begin"/>
@@ -18665,6 +18878,7 @@
         <w:docPartUnique/>
       </w:docPartObj>
     </w:sdtPr>
+    <w:sdtEndPr/>
     <w:sdtContent>
       <w:p>
         <w:pPr>
@@ -21041,7 +21255,6 @@
   <w:style w:type="character" w:default="1" w:styleId="Absatz-Standardschriftart">
     <w:name w:val="Default Paragraph Font"/>
     <w:uiPriority w:val="1"/>
-    <w:semiHidden/>
     <w:unhideWhenUsed/>
   </w:style>
   <w:style w:type="table" w:default="1" w:styleId="NormaleTabelle">

</xml_diff>